<commit_message>
Minor update for citing non-paginated articles
Added instructions for using § number for citing non-paginated online articles and chapters.
</commit_message>
<xml_diff>
--- a/Guide_1er_cycle_2025_VF.docx
+++ b/Guide_1er_cycle_2025_VF.docx
@@ -18203,6 +18203,21 @@
         <w:t>page</w:t>
       </w:r>
       <w:r>
+        <w:t xml:space="preserve"> (ou numéro de section</w:t>
+      </w:r>
+      <w:r>
+        <w:t xml:space="preserve"> [</w:t>
+      </w:r>
+      <w:r>
+        <w:t>§</w:t>
+      </w:r>
+      <w:r>
+        <w:t>]</w:t>
+      </w:r>
+      <w:r>
+        <w:t>, pour les articles en ligne sans pagination)</w:t>
+      </w:r>
+      <w:r>
         <w:t>.</w:t>
       </w:r>
     </w:p>
@@ -18326,7 +18341,34 @@
         <w:t xml:space="preserve">titre de l’ouvrage en italique, </w:t>
       </w:r>
       <w:r>
-        <w:t>lieu d’édition, nom de la maison d’édition, page.</w:t>
+        <w:t>lieu d’édition, nom de la maison d’édition, page</w:t>
+      </w:r>
+      <w:r>
+        <w:t xml:space="preserve"> </w:t>
+      </w:r>
+      <w:r>
+        <w:t>(ou numéro de section</w:t>
+      </w:r>
+      <w:r>
+        <w:t xml:space="preserve"> [</w:t>
+      </w:r>
+      <w:r>
+        <w:t>§</w:t>
+      </w:r>
+      <w:r>
+        <w:t>]</w:t>
+      </w:r>
+      <w:r>
+        <w:t xml:space="preserve">, pour les </w:t>
+      </w:r>
+      <w:r>
+        <w:t>chapitres</w:t>
+      </w:r>
+      <w:r>
+        <w:t xml:space="preserve"> en ligne sans pagination)</w:t>
+      </w:r>
+      <w:r>
+        <w:t>.</w:t>
       </w:r>
     </w:p>
     <w:p>
@@ -18928,14 +18970,6 @@
           <w:t>https://doi.org/10.7202/1088574ar</w:t>
         </w:r>
       </w:hyperlink>
-      <w:r>
-        <w:rPr>
-          <w:sz w:val="20"/>
-          <w:szCs w:val="20"/>
-          <w:lang w:val="en-CA"/>
-        </w:rPr>
-        <w:t xml:space="preserve"> </w:t>
-      </w:r>
     </w:p>
     <w:p>
       <w:pPr>
@@ -19105,6 +19139,101 @@
     </w:p>
     <w:p>
       <w:pPr>
+        <w:pStyle w:val="BodyText"/>
+        <w:numPr>
+          <w:ilvl w:val="0"/>
+          <w:numId w:val="17"/>
+        </w:numPr>
+        <w:pBdr>
+          <w:top w:val="single" w:sz="4" w:space="1" w:color="auto"/>
+          <w:left w:val="single" w:sz="4" w:space="4" w:color="auto"/>
+          <w:bottom w:val="single" w:sz="4" w:space="1" w:color="auto"/>
+          <w:right w:val="single" w:sz="4" w:space="4" w:color="auto"/>
+        </w:pBdr>
+        <w:rPr>
+          <w:sz w:val="20"/>
+          <w:szCs w:val="20"/>
+        </w:rPr>
+      </w:pPr>
+      <w:r>
+        <w:rPr>
+          <w:sz w:val="20"/>
+          <w:szCs w:val="20"/>
+          <w:lang w:val="en-CA"/>
+        </w:rPr>
+        <w:t xml:space="preserve">Richard Matthew Pollard, « Was Gregory the Great a « Roman Lawyer » ? », </w:t>
+      </w:r>
+      <w:r>
+        <w:rPr>
+          <w:i/>
+          <w:iCs/>
+          <w:sz w:val="20"/>
+          <w:szCs w:val="20"/>
+          <w:lang w:val="en-CA"/>
+        </w:rPr>
+        <w:t xml:space="preserve">Memini. </w:t>
+      </w:r>
+      <w:r>
+        <w:rPr>
+          <w:i/>
+          <w:iCs/>
+          <w:sz w:val="20"/>
+          <w:szCs w:val="20"/>
+        </w:rPr>
+        <w:t>Travaux et documents</w:t>
+      </w:r>
+      <w:r>
+        <w:rPr>
+          <w:sz w:val="20"/>
+          <w:szCs w:val="20"/>
+        </w:rPr>
+        <w:t>, vol. 31,</w:t>
+      </w:r>
+      <w:r>
+        <w:rPr>
+          <w:sz w:val="20"/>
+          <w:szCs w:val="20"/>
+        </w:rPr>
+        <w:t xml:space="preserve"> </w:t>
+      </w:r>
+      <w:r>
+        <w:rPr>
+          <w:sz w:val="20"/>
+          <w:szCs w:val="20"/>
+        </w:rPr>
+        <w:t>2025</w:t>
+      </w:r>
+      <w:r>
+        <w:rPr>
+          <w:sz w:val="20"/>
+          <w:szCs w:val="20"/>
+        </w:rPr>
+        <w:t xml:space="preserve">, </w:t>
+      </w:r>
+      <w:r>
+        <w:rPr>
+          <w:sz w:val="20"/>
+          <w:szCs w:val="20"/>
+        </w:rPr>
+        <w:t>§</w:t>
+      </w:r>
+      <w:r>
+        <w:rPr>
+          <w:sz w:val="20"/>
+          <w:szCs w:val="20"/>
+        </w:rPr>
+        <w:t>3</w:t>
+      </w:r>
+      <w:r>
+        <w:rPr>
+          <w:sz w:val="20"/>
+          <w:szCs w:val="20"/>
+        </w:rPr>
+        <w:t>.</w:t>
+      </w:r>
+    </w:p>
+    <w:p>
+      <w:pPr>
         <w:pStyle w:val="ListParagraph"/>
         <w:numPr>
           <w:ilvl w:val="0"/>
@@ -19589,7 +19718,11 @@
         <w:t xml:space="preserve"> du périodique</w:t>
       </w:r>
       <w:r>
-        <w:t xml:space="preserve">, le </w:t>
+        <w:t xml:space="preserve">, </w:t>
+      </w:r>
+      <w:r>
+        <w:lastRenderedPageBreak/>
+        <w:t xml:space="preserve">le </w:t>
       </w:r>
       <w:r>
         <w:t>numéro et l’année.</w:t>
@@ -19643,7 +19776,6 @@
         <w:ind w:firstLine="0"/>
       </w:pPr>
       <w:r>
-        <w:lastRenderedPageBreak/>
         <w:t>Il est préférable d’éviter c</w:t>
       </w:r>
       <w:r>
@@ -20586,7 +20718,11 @@
         <w:t xml:space="preserve">lois, ordonnances, </w:t>
       </w:r>
       <w:r>
-        <w:t xml:space="preserve">traités, recensements, </w:t>
+        <w:t xml:space="preserve">traités, </w:t>
+      </w:r>
+      <w:r>
+        <w:lastRenderedPageBreak/>
+        <w:t xml:space="preserve">recensements, </w:t>
       </w:r>
       <w:r>
         <w:t xml:space="preserve">correspondances, discours, pétitions, journaux, </w:t>
@@ -20622,7 +20758,6 @@
         <w:t xml:space="preserve">cartes, </w:t>
       </w:r>
       <w:r>
-        <w:lastRenderedPageBreak/>
         <w:t xml:space="preserve">registres hospitaliers, </w:t>
       </w:r>
       <w:r>
@@ -21331,7 +21466,11 @@
         <w:t xml:space="preserve"> lien URL</w:t>
       </w:r>
       <w:r>
-        <w:t xml:space="preserve">, date de consultation </w:t>
+        <w:t xml:space="preserve">, date de </w:t>
+      </w:r>
+      <w:r>
+        <w:lastRenderedPageBreak/>
+        <w:t xml:space="preserve">consultation </w:t>
       </w:r>
       <w:r>
         <w:rPr>
@@ -22176,7 +22315,11 @@
         <w:t>Montréal capitale. L’exceptionnelle histoire du site archéologique du marché Sainte-Anne et du parlement de la province du Canada,</w:t>
       </w:r>
       <w:r>
-        <w:t xml:space="preserve"> Montréal, Pointe-à-Callière, cité d’archéologie et d’histoire de Montréal</w:t>
+        <w:t xml:space="preserve"> </w:t>
+      </w:r>
+      <w:r>
+        <w:lastRenderedPageBreak/>
+        <w:t>Montréal, Pointe-à-Callière, cité d’archéologie et d’histoire de Montréal</w:t>
       </w:r>
       <w:r>
         <w:t> </w:t>
@@ -22208,7 +22351,6 @@
         </w:pBdr>
       </w:pPr>
       <w:r>
-        <w:lastRenderedPageBreak/>
         <w:t>DÉPATIE, S</w:t>
       </w:r>
       <w:r>
@@ -23454,6 +23596,7 @@
         <w:rPr>
           <w:lang w:val="en-CA"/>
         </w:rPr>
+        <w:lastRenderedPageBreak/>
         <w:t xml:space="preserve">ROBINSON, Greg, </w:t>
       </w:r>
       <w:r>
@@ -23500,7 +23643,6 @@
         <w:rPr>
           <w:lang w:val="en-CA"/>
         </w:rPr>
-        <w:lastRenderedPageBreak/>
         <w:t xml:space="preserve">WINTER, Stefan, </w:t>
       </w:r>
       <w:r>
@@ -24542,7 +24684,6 @@
     <w:p/>
     <w:p>
       <w:r>
-        <w:lastRenderedPageBreak/>
         <w:t>Si un livre est numérisé et accessible en ligne</w:t>
       </w:r>
       <w:r>
@@ -27613,9 +27754,6 @@
           <w:bottom w:val="single" w:sz="4" w:space="1" w:color="auto"/>
           <w:right w:val="single" w:sz="4" w:space="4" w:color="auto"/>
         </w:pBdr>
-        <w:rPr>
-          <w:lang w:val="en-CA"/>
-        </w:rPr>
       </w:pPr>
       <w:r>
         <w:rPr>
@@ -27697,15 +27835,11 @@
         <w:r>
           <w:rPr>
             <w:rStyle w:val="Hyperlink"/>
-            <w:lang w:val="en-CA"/>
           </w:rPr>
           <w:t>https://freedomsring.stanford.edu/</w:t>
         </w:r>
       </w:hyperlink>
       <w:r>
-        <w:rPr>
-          <w:lang w:val="en-CA"/>
-        </w:rPr>
         <w:t xml:space="preserve"> </w:t>
       </w:r>
     </w:p>
@@ -40322,7 +40456,6 @@
   <w:style w:type="character" w:default="1" w:styleId="DefaultParagraphFont">
     <w:name w:val="Default Paragraph Font"/>
     <w:uiPriority w:val="1"/>
-    <w:semiHidden/>
     <w:unhideWhenUsed/>
   </w:style>
   <w:style w:type="table" w:default="1" w:styleId="TableNormal">

</xml_diff>

<commit_message>
Updated base DOCX for citing unpaginated articles
</commit_message>
<xml_diff>
--- a/Guide_1er_cycle_2025_VF.docx
+++ b/Guide_1er_cycle_2025_VF.docx
@@ -18203,6 +18203,21 @@
         <w:t>page</w:t>
       </w:r>
       <w:r>
+        <w:t xml:space="preserve"> (ou numéro de section</w:t>
+      </w:r>
+      <w:r>
+        <w:t xml:space="preserve"> [</w:t>
+      </w:r>
+      <w:r>
+        <w:t>§</w:t>
+      </w:r>
+      <w:r>
+        <w:t>]</w:t>
+      </w:r>
+      <w:r>
+        <w:t>, pour les articles en ligne sans pagination)</w:t>
+      </w:r>
+      <w:r>
         <w:t>.</w:t>
       </w:r>
     </w:p>
@@ -18326,7 +18341,34 @@
         <w:t xml:space="preserve">titre de l’ouvrage en italique, </w:t>
       </w:r>
       <w:r>
-        <w:t>lieu d’édition, nom de la maison d’édition, page.</w:t>
+        <w:t>lieu d’édition, nom de la maison d’édition, page</w:t>
+      </w:r>
+      <w:r>
+        <w:t xml:space="preserve"> </w:t>
+      </w:r>
+      <w:r>
+        <w:t>(ou numéro de section</w:t>
+      </w:r>
+      <w:r>
+        <w:t xml:space="preserve"> [</w:t>
+      </w:r>
+      <w:r>
+        <w:t>§</w:t>
+      </w:r>
+      <w:r>
+        <w:t>]</w:t>
+      </w:r>
+      <w:r>
+        <w:t xml:space="preserve">, pour les </w:t>
+      </w:r>
+      <w:r>
+        <w:t>chapitres</w:t>
+      </w:r>
+      <w:r>
+        <w:t xml:space="preserve"> en ligne sans pagination)</w:t>
+      </w:r>
+      <w:r>
+        <w:t>.</w:t>
       </w:r>
     </w:p>
     <w:p>
@@ -18928,14 +18970,6 @@
           <w:t>https://doi.org/10.7202/1088574ar</w:t>
         </w:r>
       </w:hyperlink>
-      <w:r>
-        <w:rPr>
-          <w:sz w:val="20"/>
-          <w:szCs w:val="20"/>
-          <w:lang w:val="en-CA"/>
-        </w:rPr>
-        <w:t xml:space="preserve"> </w:t>
-      </w:r>
     </w:p>
     <w:p>
       <w:pPr>
@@ -19105,6 +19139,101 @@
     </w:p>
     <w:p>
       <w:pPr>
+        <w:pStyle w:val="BodyText"/>
+        <w:numPr>
+          <w:ilvl w:val="0"/>
+          <w:numId w:val="17"/>
+        </w:numPr>
+        <w:pBdr>
+          <w:top w:val="single" w:sz="4" w:space="1" w:color="auto"/>
+          <w:left w:val="single" w:sz="4" w:space="4" w:color="auto"/>
+          <w:bottom w:val="single" w:sz="4" w:space="1" w:color="auto"/>
+          <w:right w:val="single" w:sz="4" w:space="4" w:color="auto"/>
+        </w:pBdr>
+        <w:rPr>
+          <w:sz w:val="20"/>
+          <w:szCs w:val="20"/>
+        </w:rPr>
+      </w:pPr>
+      <w:r>
+        <w:rPr>
+          <w:sz w:val="20"/>
+          <w:szCs w:val="20"/>
+          <w:lang w:val="en-CA"/>
+        </w:rPr>
+        <w:t xml:space="preserve">Richard Matthew Pollard, « Was Gregory the Great a « Roman Lawyer » ? », </w:t>
+      </w:r>
+      <w:r>
+        <w:rPr>
+          <w:i/>
+          <w:iCs/>
+          <w:sz w:val="20"/>
+          <w:szCs w:val="20"/>
+          <w:lang w:val="en-CA"/>
+        </w:rPr>
+        <w:t xml:space="preserve">Memini. </w:t>
+      </w:r>
+      <w:r>
+        <w:rPr>
+          <w:i/>
+          <w:iCs/>
+          <w:sz w:val="20"/>
+          <w:szCs w:val="20"/>
+        </w:rPr>
+        <w:t>Travaux et documents</w:t>
+      </w:r>
+      <w:r>
+        <w:rPr>
+          <w:sz w:val="20"/>
+          <w:szCs w:val="20"/>
+        </w:rPr>
+        <w:t>, vol. 31,</w:t>
+      </w:r>
+      <w:r>
+        <w:rPr>
+          <w:sz w:val="20"/>
+          <w:szCs w:val="20"/>
+        </w:rPr>
+        <w:t xml:space="preserve"> </w:t>
+      </w:r>
+      <w:r>
+        <w:rPr>
+          <w:sz w:val="20"/>
+          <w:szCs w:val="20"/>
+        </w:rPr>
+        <w:t>2025</w:t>
+      </w:r>
+      <w:r>
+        <w:rPr>
+          <w:sz w:val="20"/>
+          <w:szCs w:val="20"/>
+        </w:rPr>
+        <w:t xml:space="preserve">, </w:t>
+      </w:r>
+      <w:r>
+        <w:rPr>
+          <w:sz w:val="20"/>
+          <w:szCs w:val="20"/>
+        </w:rPr>
+        <w:t>§</w:t>
+      </w:r>
+      <w:r>
+        <w:rPr>
+          <w:sz w:val="20"/>
+          <w:szCs w:val="20"/>
+        </w:rPr>
+        <w:t>3</w:t>
+      </w:r>
+      <w:r>
+        <w:rPr>
+          <w:sz w:val="20"/>
+          <w:szCs w:val="20"/>
+        </w:rPr>
+        <w:t>.</w:t>
+      </w:r>
+    </w:p>
+    <w:p>
+      <w:pPr>
         <w:pStyle w:val="ListParagraph"/>
         <w:numPr>
           <w:ilvl w:val="0"/>
@@ -19589,7 +19718,11 @@
         <w:t xml:space="preserve"> du périodique</w:t>
       </w:r>
       <w:r>
-        <w:t xml:space="preserve">, le </w:t>
+        <w:t xml:space="preserve">, </w:t>
+      </w:r>
+      <w:r>
+        <w:lastRenderedPageBreak/>
+        <w:t xml:space="preserve">le </w:t>
       </w:r>
       <w:r>
         <w:t>numéro et l’année.</w:t>
@@ -19643,7 +19776,6 @@
         <w:ind w:firstLine="0"/>
       </w:pPr>
       <w:r>
-        <w:lastRenderedPageBreak/>
         <w:t>Il est préférable d’éviter c</w:t>
       </w:r>
       <w:r>
@@ -20586,7 +20718,11 @@
         <w:t xml:space="preserve">lois, ordonnances, </w:t>
       </w:r>
       <w:r>
-        <w:t xml:space="preserve">traités, recensements, </w:t>
+        <w:t xml:space="preserve">traités, </w:t>
+      </w:r>
+      <w:r>
+        <w:lastRenderedPageBreak/>
+        <w:t xml:space="preserve">recensements, </w:t>
       </w:r>
       <w:r>
         <w:t xml:space="preserve">correspondances, discours, pétitions, journaux, </w:t>
@@ -20622,7 +20758,6 @@
         <w:t xml:space="preserve">cartes, </w:t>
       </w:r>
       <w:r>
-        <w:lastRenderedPageBreak/>
         <w:t xml:space="preserve">registres hospitaliers, </w:t>
       </w:r>
       <w:r>
@@ -21331,7 +21466,11 @@
         <w:t xml:space="preserve"> lien URL</w:t>
       </w:r>
       <w:r>
-        <w:t xml:space="preserve">, date de consultation </w:t>
+        <w:t xml:space="preserve">, date de </w:t>
+      </w:r>
+      <w:r>
+        <w:lastRenderedPageBreak/>
+        <w:t xml:space="preserve">consultation </w:t>
       </w:r>
       <w:r>
         <w:rPr>
@@ -22176,7 +22315,11 @@
         <w:t>Montréal capitale. L’exceptionnelle histoire du site archéologique du marché Sainte-Anne et du parlement de la province du Canada,</w:t>
       </w:r>
       <w:r>
-        <w:t xml:space="preserve"> Montréal, Pointe-à-Callière, cité d’archéologie et d’histoire de Montréal</w:t>
+        <w:t xml:space="preserve"> </w:t>
+      </w:r>
+      <w:r>
+        <w:lastRenderedPageBreak/>
+        <w:t>Montréal, Pointe-à-Callière, cité d’archéologie et d’histoire de Montréal</w:t>
       </w:r>
       <w:r>
         <w:t> </w:t>
@@ -22208,7 +22351,6 @@
         </w:pBdr>
       </w:pPr>
       <w:r>
-        <w:lastRenderedPageBreak/>
         <w:t>DÉPATIE, S</w:t>
       </w:r>
       <w:r>
@@ -23454,6 +23596,7 @@
         <w:rPr>
           <w:lang w:val="en-CA"/>
         </w:rPr>
+        <w:lastRenderedPageBreak/>
         <w:t xml:space="preserve">ROBINSON, Greg, </w:t>
       </w:r>
       <w:r>
@@ -23500,7 +23643,6 @@
         <w:rPr>
           <w:lang w:val="en-CA"/>
         </w:rPr>
-        <w:lastRenderedPageBreak/>
         <w:t xml:space="preserve">WINTER, Stefan, </w:t>
       </w:r>
       <w:r>
@@ -24542,7 +24684,6 @@
     <w:p/>
     <w:p>
       <w:r>
-        <w:lastRenderedPageBreak/>
         <w:t>Si un livre est numérisé et accessible en ligne</w:t>
       </w:r>
       <w:r>
@@ -27613,9 +27754,6 @@
           <w:bottom w:val="single" w:sz="4" w:space="1" w:color="auto"/>
           <w:right w:val="single" w:sz="4" w:space="4" w:color="auto"/>
         </w:pBdr>
-        <w:rPr>
-          <w:lang w:val="en-CA"/>
-        </w:rPr>
       </w:pPr>
       <w:r>
         <w:rPr>
@@ -27697,15 +27835,11 @@
         <w:r>
           <w:rPr>
             <w:rStyle w:val="Hyperlink"/>
-            <w:lang w:val="en-CA"/>
           </w:rPr>
           <w:t>https://freedomsring.stanford.edu/</w:t>
         </w:r>
       </w:hyperlink>
       <w:r>
-        <w:rPr>
-          <w:lang w:val="en-CA"/>
-        </w:rPr>
         <w:t xml:space="preserve"> </w:t>
       </w:r>
     </w:p>
@@ -40322,7 +40456,6 @@
   <w:style w:type="character" w:default="1" w:styleId="DefaultParagraphFont">
     <w:name w:val="Default Paragraph Font"/>
     <w:uiPriority w:val="1"/>
-    <w:semiHidden/>
     <w:unhideWhenUsed/>
   </w:style>
   <w:style w:type="table" w:default="1" w:styleId="TableNormal">

</xml_diff>